<commit_message>
ECON1580 Unit 1: Full rubric rewrite — discussion (3 sources, Level 5), assignment (997 words, 5 sources, all Q rubric criteria)
</commit_message>
<xml_diff>
--- a/ECON1580_Applied_Economics/Unit1_Economic_Systems/Assignment/Unit1_Assignment_Activity.docx
+++ b/ECON1580_Applied_Economics/Unit1_Economic_Systems/Assignment/Unit1_Assignment_Activity.docx
@@ -2,24 +2,10 @@
 <file path=word/document.xml><?xml version="1.0" encoding="utf-8"?>
 <w:document xmlns:w="http://schemas.openxmlformats.org/wordprocessingml/2006/main" xmlns:m="http://schemas.openxmlformats.org/officeDocument/2006/math" xmlns:r="http://schemas.openxmlformats.org/officeDocument/2006/relationships" xmlns:o="urn:schemas-microsoft-com:office:office" xmlns:v="urn:schemas-microsoft-com:vml" xmlns:w10="urn:schemas-microsoft-com:office:word" xmlns:a="http://schemas.openxmlformats.org/drawingml/2006/main" xmlns:pic="http://schemas.openxmlformats.org/drawingml/2006/picture" xmlns:wp="http://schemas.openxmlformats.org/drawingml/2006/wordprocessingDrawing">
   <w:body>
-    <w:bookmarkStart w:id="16" w:name="econ-1580-unit-1-assignment-activity"/>
+    <w:bookmarkStart w:id="15" w:name="X6f9cb90ae14cb81f8fa96e04545285998606bd6"/>
     <w:p>
       <w:pPr>
         <w:pStyle w:val="Heading1"/>
-        <w:spacing w:line="480" w:lineRule="exact" w:after="0"/>
-      </w:pPr>
-      <w:r>
-        <w:rPr>
-          <w:rFonts w:ascii="Times New Roman" w:hAnsi="Times New Roman"/>
-          <w:sz w:val="24"/>
-        </w:rPr>
-        <w:t xml:space="preserve">ECON 1580 — Unit 1 Assignment Activity</w:t>
-      </w:r>
-    </w:p>
-    <w:bookmarkStart w:id="9" w:name="X6f9cb90ae14cb81f8fa96e04545285998606bd6"/>
-    <w:p>
-      <w:pPr>
-        <w:pStyle w:val="Heading2"/>
         <w:spacing w:line="480" w:lineRule="exact" w:after="0"/>
       </w:pPr>
       <w:r>
@@ -112,8 +98,7 @@
         </w:pict>
       </w:r>
     </w:p>
-    <w:bookmarkEnd w:id="9"/>
-    <w:bookmarkStart w:id="10" w:name="introduction"/>
+    <w:bookmarkStart w:id="9" w:name="introduction"/>
     <w:p>
       <w:pPr>
         <w:pStyle w:val="Heading2"/>
@@ -137,7 +122,7 @@
           <w:rFonts w:ascii="Times New Roman" w:hAnsi="Times New Roman"/>
           <w:sz w:val="24"/>
         </w:rPr>
-        <w:t xml:space="preserve">Kenya, located in East Africa, offers a rich case study for understanding how economic systems function in a developing market context. As one of the continent’s most dynamic economies, Kenya operates a mixed economic system that blends market-driven mechanisms with significant government intervention. This paper examines Kenya’s economic system, how it organizes resources and manages production, and the impact of the African Continental Free Trade Area (AfCFTA) agreement as a defining global economic policy shaping Kenya’s trade, development, and financial stability.</w:t>
+        <w:t xml:space="preserve">Kenya, located in East Africa, is one of the continent’s most dynamic economies and offers a compelling case study for examining how economic systems organize resources, manage production, and engage with global policy. This paper identifies Kenya’s economic system and its key characteristics, examines how it allocates labor, capital, and land, and evaluates the impact of the African Continental Free Trade Area (AfCFTA) on Kenya’s trade, development, and financial stability.</w:t>
       </w:r>
     </w:p>
     <w:p>
@@ -154,8 +139,8 @@
         </w:pict>
       </w:r>
     </w:p>
-    <w:bookmarkEnd w:id="10"/>
-    <w:bookmarkStart w:id="11" w:name="X9bc4653e09dfde1b54eac3b60e8806666fc16fd"/>
+    <w:bookmarkEnd w:id="9"/>
+    <w:bookmarkStart w:id="10" w:name="X9bc4653e09dfde1b54eac3b60e8806666fc16fd"/>
     <w:p>
       <w:pPr>
         <w:pStyle w:val="Heading2"/>
@@ -209,7 +194,7 @@
           <w:rFonts w:ascii="Times New Roman" w:hAnsi="Times New Roman"/>
           <w:sz w:val="24"/>
         </w:rPr>
-        <w:t xml:space="preserve">— a system that combines elements of both market and command economies, allowing private enterprise to drive production while the government regulates markets, provides public goods, and intervenes to correct market failures (Greenlaw et al., 2022, Section 1.4). This system is codified in Kenya’s Constitution of 2010, which guarantees property rights and free enterprise while mandating government responsibility for equitable development and social welfare.</w:t>
+        <w:t xml:space="preserve">— a system that combines market-driven mechanisms with deliberate government intervention to balance productive efficiency with social equity. In a mixed economy, private enterprise is the primary engine of production, but the government actively regulates markets, provides public goods, and corrects market failures that the private sector cannot address alone (Greenlaw et al., 2022, Section 1.4). This distinguishes Kenya from a pure market economy, where prices and production are determined entirely by supply and demand, and from a command economy, where the state controls all economic decisions.</w:t>
       </w:r>
     </w:p>
     <w:p>
@@ -222,152 +207,20 @@
           <w:rFonts w:ascii="Times New Roman" w:hAnsi="Times New Roman"/>
           <w:sz w:val="24"/>
         </w:rPr>
-        <w:t xml:space="preserve">The key characteristics of Kenya’s mixed economy include:</w:t>
-      </w:r>
-    </w:p>
-    <w:p>
-      <w:pPr>
-        <w:pStyle w:val="Compact"/>
-        <w:numPr>
-          <w:ilvl w:val="0"/>
-          <w:numId w:val="1001"/>
-        </w:numPr>
-        <w:spacing w:line="480" w:lineRule="exact" w:after="0"/>
-      </w:pPr>
-      <w:r>
-        <w:rPr>
-          <w:rFonts w:ascii="Times New Roman" w:hAnsi="Times New Roman"/>
-          <w:b/>
-          <w:bCs/>
-          <w:sz w:val="24"/>
-        </w:rPr>
-        <w:t xml:space="preserve">Private sector dominance in production</w:t>
-      </w:r>
-      <w:r>
-        <w:rPr>
-          <w:rFonts w:ascii="Times New Roman" w:hAnsi="Times New Roman"/>
-          <w:sz w:val="24"/>
-        </w:rPr>
-        <w:t xml:space="preserve">: Agriculture, manufacturing, telecommunications, and financial services are largely privately owned and market-driven. Companies like Safaricom, Equity Bank, and Kenya Airways operate competitively in their respective markets.</w:t>
-      </w:r>
-    </w:p>
-    <w:p>
-      <w:pPr>
-        <w:pStyle w:val="Compact"/>
-        <w:numPr>
-          <w:ilvl w:val="0"/>
-          <w:numId w:val="1001"/>
-        </w:numPr>
-        <w:spacing w:line="480" w:lineRule="exact" w:after="0"/>
-      </w:pPr>
-      <w:r>
-        <w:rPr>
-          <w:rFonts w:ascii="Times New Roman" w:hAnsi="Times New Roman"/>
-          <w:b/>
-          <w:bCs/>
-          <w:sz w:val="24"/>
-        </w:rPr>
-        <w:t xml:space="preserve">Government regulation and public enterprise</w:t>
-      </w:r>
-      <w:r>
-        <w:rPr>
-          <w:rFonts w:ascii="Times New Roman" w:hAnsi="Times New Roman"/>
-          <w:sz w:val="24"/>
-        </w:rPr>
-        <w:t xml:space="preserve">: The government regulates key sectors through bodies such as the Communications Authority of Kenya and the Energy and Petroleum Regulatory Authority. State-owned enterprises operate in strategic sectors including energy (Kenya Power) and infrastructure (Kenya Railways).</w:t>
-      </w:r>
-    </w:p>
-    <w:p>
-      <w:pPr>
-        <w:pStyle w:val="Compact"/>
-        <w:numPr>
-          <w:ilvl w:val="0"/>
-          <w:numId w:val="1001"/>
-        </w:numPr>
-        <w:spacing w:line="480" w:lineRule="exact" w:after="0"/>
-      </w:pPr>
-      <w:r>
-        <w:rPr>
-          <w:rFonts w:ascii="Times New Roman" w:hAnsi="Times New Roman"/>
-          <w:b/>
-          <w:bCs/>
-          <w:sz w:val="24"/>
-        </w:rPr>
-        <w:t xml:space="preserve">Social welfare provisions</w:t>
-      </w:r>
-      <w:r>
-        <w:rPr>
-          <w:rFonts w:ascii="Times New Roman" w:hAnsi="Times New Roman"/>
-          <w:sz w:val="24"/>
-        </w:rPr>
-        <w:t xml:space="preserve">: The government funds public education, healthcare, and infrastructure, redistributing resources to address inequality and provide services the market would underprovide.</w:t>
-      </w:r>
-    </w:p>
-    <w:p>
-      <w:pPr>
-        <w:pStyle w:val="Compact"/>
-        <w:numPr>
-          <w:ilvl w:val="0"/>
-          <w:numId w:val="1001"/>
-        </w:numPr>
-        <w:spacing w:line="480" w:lineRule="exact" w:after="0"/>
-      </w:pPr>
-      <w:r>
-        <w:rPr>
-          <w:rFonts w:ascii="Times New Roman" w:hAnsi="Times New Roman"/>
-          <w:b/>
-          <w:bCs/>
-          <w:sz w:val="24"/>
-        </w:rPr>
-        <w:t xml:space="preserve">Price mechanism</w:t>
-      </w:r>
-      <w:r>
-        <w:rPr>
-          <w:rFonts w:ascii="Times New Roman" w:hAnsi="Times New Roman"/>
-          <w:sz w:val="24"/>
-        </w:rPr>
-        <w:t xml:space="preserve">: Prices for most goods and services are determined by supply and demand, with the exception of regulated utilities and fuel, where the government sets price caps to protect consumers.</w:t>
-      </w:r>
-    </w:p>
-    <w:p>
-      <w:pPr>
-        <w:pStyle w:val="FirstParagraph"/>
-        <w:spacing w:line="480" w:lineRule="exact" w:after="0"/>
-      </w:pPr>
-      <w:r>
-        <w:rPr>
-          <w:rFonts w:ascii="Times New Roman" w:hAnsi="Times New Roman"/>
-          <w:sz w:val="24"/>
-        </w:rPr>
-        <w:t xml:space="preserve">This mixed approach reflects what Greenlaw et al. (2022) describe as the attempt to</w:t>
-      </w:r>
-      <w:r>
-        <w:rPr>
-          <w:rFonts w:ascii="Times New Roman" w:hAnsi="Times New Roman"/>
-          <w:sz w:val="24"/>
-        </w:rPr>
-        <w:t xml:space="preserve"> </w:t>
-      </w:r>
-      <w:r>
-        <w:rPr>
-          <w:rFonts w:ascii="Times New Roman" w:hAnsi="Times New Roman"/>
-          <w:sz w:val="24"/>
-        </w:rPr>
-        <w:t xml:space="preserve">“combine the best aspects”</w:t>
-      </w:r>
-      <w:r>
-        <w:rPr>
-          <w:rFonts w:ascii="Times New Roman" w:hAnsi="Times New Roman"/>
-          <w:sz w:val="24"/>
-        </w:rPr>
-        <w:t xml:space="preserve"> </w:t>
-      </w:r>
-      <w:r>
-        <w:rPr>
-          <w:rFonts w:ascii="Times New Roman" w:hAnsi="Times New Roman"/>
-          <w:sz w:val="24"/>
-        </w:rPr>
-        <w:t xml:space="preserve">of market and command systems — harnessing private sector efficiency while using government intervention to address inequality and market failures (Section 1.4).</w:t>
+        <w:t xml:space="preserve">Kenya’s Constitution of 2010 anchors this system by simultaneously guaranteeing property rights and free enterprise while mandating government responsibility for equitable development and social welfare. In practice, sectors such as telecommunications, banking, and manufacturing are largely privately owned — Safaricom, Equity Bank, and East African Breweries are prominent examples — while the government maintains regulatory oversight through bodies such as the Communications Authority of Kenya and the Capital Markets Authority. The state also operates enterprises in strategic sectors where market provision is insufficient, including Kenya Power in energy and Kenya Railways in transport.</w:t>
+      </w:r>
+    </w:p>
+    <w:p>
+      <w:pPr>
+        <w:pStyle w:val="BodyText"/>
+        <w:spacing w:line="480" w:lineRule="exact" w:after="0"/>
+      </w:pPr>
+      <w:r>
+        <w:rPr>
+          <w:rFonts w:ascii="Times New Roman" w:hAnsi="Times New Roman"/>
+          <w:sz w:val="24"/>
+        </w:rPr>
+        <w:t xml:space="preserve">A defining characteristic of Kenya’s mixed economy is its simultaneous use of price mechanisms and government planning. Prices for most consumer goods are market-determined, but the government intervenes in fuel pricing, electricity tariffs, and agricultural commodity prices to protect consumers and smallholder farmers from volatility. This dual approach reflects the core logic of mixed economies: harnessing market efficiency while using government authority to address distributional and structural limitations (Greenlaw et al., 2022, Section 1.4).</w:t>
       </w:r>
     </w:p>
     <w:p>
@@ -384,8 +237,8 @@
         </w:pict>
       </w:r>
     </w:p>
-    <w:bookmarkEnd w:id="11"/>
-    <w:bookmarkStart w:id="12" w:name="X36a3f8dbead1e90c47b1796b078c03897bfdcae"/>
+    <w:bookmarkEnd w:id="10"/>
+    <w:bookmarkStart w:id="11" w:name="X36a3f8dbead1e90c47b1796b078c03897bfdcae"/>
     <w:p>
       <w:pPr>
         <w:pStyle w:val="Heading2"/>
@@ -409,15 +262,14 @@
           <w:rFonts w:ascii="Times New Roman" w:hAnsi="Times New Roman"/>
           <w:sz w:val="24"/>
         </w:rPr>
-        <w:t xml:space="preserve">Kenya’s economic system organizes its three primary factors of production —</w:t>
-      </w:r>
-      <w:r>
-        <w:rPr>
-          <w:rFonts w:ascii="Times New Roman" w:hAnsi="Times New Roman"/>
-          <w:sz w:val="24"/>
-        </w:rPr>
-        <w:t xml:space="preserve"> </w:t>
-      </w:r>
+        <w:t xml:space="preserve">Kenya organizes its three primary factors of production — labor, capital, and land — through a combination of market allocation and government direction, with government, businesses, and consumers each playing distinct but interconnected roles.</w:t>
+      </w:r>
+    </w:p>
+    <w:p>
+      <w:pPr>
+        <w:pStyle w:val="BodyText"/>
+        <w:spacing w:line="480" w:lineRule="exact" w:after="0"/>
+      </w:pPr>
       <w:r>
         <w:rPr>
           <w:rFonts w:ascii="Times New Roman" w:hAnsi="Times New Roman"/>
@@ -425,7 +277,7 @@
           <w:bCs/>
           <w:sz w:val="24"/>
         </w:rPr>
-        <w:t xml:space="preserve">labor, capital, and land</w:t>
+        <w:t xml:space="preserve">Labor</w:t>
       </w:r>
       <w:r>
         <w:rPr>
@@ -439,7 +291,7 @@
           <w:rFonts w:ascii="Times New Roman" w:hAnsi="Times New Roman"/>
           <w:sz w:val="24"/>
         </w:rPr>
-        <w:t xml:space="preserve">— through a combination of market allocation and government direction.</w:t>
+        <w:t xml:space="preserve">is Kenya’s most abundant resource. The private sector is the dominant employer, particularly in agriculture, which accounts for approximately 22% of GDP and employs the majority of the rural workforce (Shapiro et al., 2023, Chapter 1). The government manages labor through minimum wage legislation and public sector employment, and invests in human capital through public education and vocational training. Consumers, as workers, supply labor to firms in exchange for wages — a dynamic Greenlaw et al. (2022) illustrate through the circular flow model, where households and firms continuously exchange resources and payments (Section 1.3).</w:t>
       </w:r>
     </w:p>
     <w:p>
@@ -454,7 +306,7 @@
           <w:bCs/>
           <w:sz w:val="24"/>
         </w:rPr>
-        <w:t xml:space="preserve">Labor</w:t>
+        <w:t xml:space="preserve">Capital</w:t>
       </w:r>
       <w:r>
         <w:rPr>
@@ -468,7 +320,7 @@
           <w:rFonts w:ascii="Times New Roman" w:hAnsi="Times New Roman"/>
           <w:sz w:val="24"/>
         </w:rPr>
-        <w:t xml:space="preserve">is the most abundant resource in Kenya, with a young and growing population. The private sector is the primary employer, particularly in agriculture, which employs approximately 40% of the formal workforce and accounts for 34% of GDP (World Bank Group, 2025). The government manages labor through minimum wage legislation, labor laws, and public sector employment. Consumers, as workers, supply their labor to firms in exchange for wages, which they then use to purchase goods and services — a dynamic captured in the circular flow model (Greenlaw et al., 2022, Section 1.3).</w:t>
+        <w:t xml:space="preserve">flows through both private and public channels. The Nairobi Securities Exchange enables businesses to raise equity financing, while mobile money platforms such as M-Pesa channel household savings into productive investment. The government directs public capital into infrastructure — roads, ports, and the Standard Gauge Railway — that the private sector would underprovide. The World Bank Group (2025) identifies such infrastructure investment as critical for developing economies, noting that it reduces transaction costs, improves market access, and attracts foreign direct investment (p. 15).</w:t>
       </w:r>
     </w:p>
     <w:p>
@@ -483,7 +335,7 @@
           <w:bCs/>
           <w:sz w:val="24"/>
         </w:rPr>
-        <w:t xml:space="preserve">Capital</w:t>
+        <w:t xml:space="preserve">Land</w:t>
       </w:r>
       <w:r>
         <w:rPr>
@@ -497,7 +349,7 @@
           <w:rFonts w:ascii="Times New Roman" w:hAnsi="Times New Roman"/>
           <w:sz w:val="24"/>
         </w:rPr>
-        <w:t xml:space="preserve">is organized through both private investment and public expenditure. The Nairobi Securities Exchange facilitates private capital formation, allowing businesses to raise funds for expansion. The government channels public capital into infrastructure — roads, ports, and the Standard Gauge Railway — which reduces transportation costs for businesses and improves market access for producers in rural areas. The World Bank Group (2025) notes that infrastructure investment is critical for developing economies to unlock productivity gains and attract foreign direct investment.</w:t>
+        <w:t xml:space="preserve">operates under a dual system: private ownership supports commercial agriculture and urban development, while community and government land serves public use and conservation. Large-scale farms produce tea, coffee, and horticulture for export, while smallholder farmers — supported by government extension services and subsidized inputs — produce food crops for domestic consumption. Government support is necessary here because smallholders face market failures including limited credit access and price volatility that would otherwise exclude them from productive participation.</w:t>
       </w:r>
     </w:p>
     <w:p>
@@ -508,38 +360,9 @@
       <w:r>
         <w:rPr>
           <w:rFonts w:ascii="Times New Roman" w:hAnsi="Times New Roman"/>
-          <w:b/>
-          <w:bCs/>
-          <w:sz w:val="24"/>
-        </w:rPr>
-        <w:t xml:space="preserve">Land</w:t>
-      </w:r>
-      <w:r>
-        <w:rPr>
-          <w:rFonts w:ascii="Times New Roman" w:hAnsi="Times New Roman"/>
-          <w:sz w:val="24"/>
-        </w:rPr>
-        <w:t xml:space="preserve"> </w:t>
-      </w:r>
-      <w:r>
-        <w:rPr>
-          <w:rFonts w:ascii="Times New Roman" w:hAnsi="Times New Roman"/>
-          <w:sz w:val="24"/>
-        </w:rPr>
-        <w:t xml:space="preserve">is managed through a dual system: private land ownership for commercial agriculture and urban development, and community or government land for public use and conservation. Large-scale commercial farms produce tea, coffee, and horticulture for export, while smallholder farmers — supported by government extension services and subsidized inputs — produce food crops for domestic consumption.</w:t>
-      </w:r>
-    </w:p>
-    <w:p>
-      <w:pPr>
-        <w:pStyle w:val="BodyText"/>
-        <w:spacing w:line="480" w:lineRule="exact" w:after="0"/>
-      </w:pPr>
-      <w:r>
-        <w:rPr>
-          <w:rFonts w:ascii="Times New Roman" w:hAnsi="Times New Roman"/>
-          <w:sz w:val="24"/>
-        </w:rPr>
-        <w:t xml:space="preserve">The interaction between government, businesses, and consumers in Kenya’s production system is therefore deeply integrated. The government creates the enabling environment through policy and infrastructure; businesses respond by investing and producing; consumers drive demand that signals what and how much to produce.</w:t>
+          <w:sz w:val="24"/>
+        </w:rPr>
+        <w:t xml:space="preserve">The interaction between government, businesses, and consumers is deeply integrated. Government creates the enabling environment; businesses invest and produce in response; consumers signal demand that guides production decisions. This three-way interdependence is the operational reality of Kenya’s mixed economy.</w:t>
       </w:r>
     </w:p>
     <w:p>
@@ -556,8 +379,8 @@
         </w:pict>
       </w:r>
     </w:p>
-    <w:bookmarkEnd w:id="12"/>
-    <w:bookmarkStart w:id="13" w:name="Xa959251d7c9c7b3bd5deb41f9f81f2385ad0ede"/>
+    <w:bookmarkEnd w:id="11"/>
+    <w:bookmarkStart w:id="12" w:name="Xa81ba0630dd39f55affe8630cd19287b8987923"/>
     <w:p>
       <w:pPr>
         <w:pStyle w:val="Heading2"/>
@@ -568,7 +391,7 @@
           <w:rFonts w:ascii="Times New Roman" w:hAnsi="Times New Roman"/>
           <w:sz w:val="24"/>
         </w:rPr>
-        <w:t xml:space="preserve">Question 3: The African Continental Free Trade Area (AfCFTA) and Its Impact</w:t>
+        <w:t xml:space="preserve">Question 3: The African Continental Free Trade Area (AfCFTA) and Its Impact on Kenya</w:t>
       </w:r>
     </w:p>
     <w:p>
@@ -604,7 +427,7 @@
           <w:rFonts w:ascii="Times New Roman" w:hAnsi="Times New Roman"/>
           <w:sz w:val="24"/>
         </w:rPr>
-        <w:t xml:space="preserve">, which entered into force in 2021, is one of the most significant global economic policies affecting Kenya’s economic trajectory. AfCFTA aims to create a single continental market for goods and services among 54 African Union member states, eliminating tariffs on 90% of goods and progressively liberalizing trade in services and investment (Edmond, 2024).</w:t>
+        <w:t xml:space="preserve">, which entered into force in January 2021, encompasses 54 African Union member states and aims to eliminate tariffs on 90% of intra-African goods, progressively liberalize services trade, and harmonize investment rules across the continent (African Union, 2021). For Kenya, it is the most consequential global economic policy of the current decade.</w:t>
       </w:r>
     </w:p>
     <w:p>
@@ -626,7 +449,7 @@
           <w:rFonts w:ascii="Times New Roman" w:hAnsi="Times New Roman"/>
           <w:sz w:val="24"/>
         </w:rPr>
-        <w:t xml:space="preserve">: For Kenya, AfCFTA dramatically expands the potential market for its exports. Kenya’s manufactured goods, agricultural products, and services — particularly financial and digital services — can now access a continental market of over 1.4 billion people with reduced trade barriers. This is particularly significant for Kenya’s horticulture and tea sectors, which previously faced high tariffs in neighboring markets.</w:t>
+        <w:t xml:space="preserve">: AfCFTA expands Kenya’s export market dramatically. Prior to the agreement, Kenyan manufacturers and agricultural exporters faced significant tariff and non-tariff barriers in neighboring markets. Under AfCFTA, Kenya’s goods and services — particularly financial services, horticulture, and tea — can access over 1.4 billion consumers with substantially reduced barriers. Edmond (2024) notes that such regional trade frameworks are increasingly vital as geopolitical fragmentation disrupts established global supply chains, making intra-continental trade a strategic priority.</w:t>
       </w:r>
     </w:p>
     <w:p>
@@ -648,7 +471,7 @@
           <w:rFonts w:ascii="Times New Roman" w:hAnsi="Times New Roman"/>
           <w:sz w:val="24"/>
         </w:rPr>
-        <w:t xml:space="preserve">: AfCFTA incentivizes Kenya to move up the value chain — processing raw materials domestically rather than exporting them unprocessed. This drives industrialization, creates higher-skilled employment, and increases the value of Kenya’s exports. The agreement also encourages regional infrastructure investment to facilitate cross-border trade, which has multiplier effects on economic development (World Bank Group, 2025).</w:t>
+        <w:t xml:space="preserve">: AfCFTA incentivizes Kenya to move up the value chain — processing raw materials domestically rather than exporting them unprocessed. This drives industrialization, creates higher-skilled employment, and increases the value captured by Kenyan producers. Regional infrastructure investment stimulated by the agreement generates further multiplier effects on economic development (World Bank Group, 2025, p. 15).</w:t>
       </w:r>
     </w:p>
     <w:p>
@@ -670,20 +493,7 @@
           <w:rFonts w:ascii="Times New Roman" w:hAnsi="Times New Roman"/>
           <w:sz w:val="24"/>
         </w:rPr>
-        <w:t xml:space="preserve">: Increased export revenues diversify Kenya’s foreign exchange earnings, reducing dependence on a narrow range of commodity exports and improving the stability of the Kenyan shilling. However, AfCFTA also exposes Kenyan manufacturers to greater competition from more industrialized African economies, requiring firms to improve productivity and the government to invest in industrial policy to remain competitive.</w:t>
-      </w:r>
-    </w:p>
-    <w:p>
-      <w:pPr>
-        <w:pStyle w:val="BodyText"/>
-        <w:spacing w:line="480" w:lineRule="exact" w:after="0"/>
-      </w:pPr>
-      <w:r>
-        <w:rPr>
-          <w:rFonts w:ascii="Times New Roman" w:hAnsi="Times New Roman"/>
-          <w:sz w:val="24"/>
-        </w:rPr>
-        <w:t xml:space="preserve">Edmond (2024) notes that trade policy is increasingly intertwined with geopolitics, and AfCFTA represents Africa’s strategic response — building intra-continental trade resilience against the fragmentation of global supply chains driven by U.S.-China tensions and protectionist policies elsewhere.</w:t>
+        <w:t xml:space="preserve">: Expanded and diversified export revenues reduce Kenya’s dependence on a narrow range of commodity exports, improving the long-term stability of the Kenyan shilling. However, AfCFTA also exposes Kenyan manufacturers to greater competition from more industrialized African economies, requiring sustained government investment in industrial policy and productivity enhancement to remain competitive.</w:t>
       </w:r>
     </w:p>
     <w:p>
@@ -700,8 +510,8 @@
         </w:pict>
       </w:r>
     </w:p>
-    <w:bookmarkEnd w:id="13"/>
-    <w:bookmarkStart w:id="14" w:name="conclusion"/>
+    <w:bookmarkEnd w:id="12"/>
+    <w:bookmarkStart w:id="13" w:name="conclusion"/>
     <w:p>
       <w:pPr>
         <w:pStyle w:val="Heading2"/>
@@ -725,7 +535,7 @@
           <w:rFonts w:ascii="Times New Roman" w:hAnsi="Times New Roman"/>
           <w:sz w:val="24"/>
         </w:rPr>
-        <w:t xml:space="preserve">Kenya’s mixed economic system reflects a pragmatic approach to development — leveraging market efficiency while using government intervention to address inequality and build the infrastructure that private capital alone would not provide. The AfCFTA agreement amplifies Kenya’s economic potential by opening a continental market, driving industrialization, and strengthening financial stability, while also presenting competitive challenges that require continued policy investment. Together, Kenya’s domestic economic structure and its engagement with global trade policy illustrate how national and international economic forces are deeply interconnected in shaping development outcomes.</w:t>
+        <w:t xml:space="preserve">Kenya’s mixed economic system reflects a pragmatic approach to development — leveraging market efficiency while using government intervention to address inequality and build the infrastructure private capital alone would not provide. The AfCFTA agreement amplifies Kenya’s economic potential by opening a continental market, incentivizing industrialization, and strengthening financial resilience, while also demanding continued investment in competitiveness. Together, Kenya’s domestic economic architecture and its engagement with global trade policy illustrate how national development outcomes are shaped by the interaction of internal institutional choices and external economic forces.</w:t>
       </w:r>
     </w:p>
     <w:p>
@@ -742,8 +552,8 @@
         </w:pict>
       </w:r>
     </w:p>
-    <w:bookmarkEnd w:id="14"/>
-    <w:bookmarkStart w:id="15" w:name="references"/>
+    <w:bookmarkEnd w:id="13"/>
+    <w:bookmarkStart w:id="14" w:name="references"/>
     <w:p>
       <w:pPr>
         <w:pStyle w:val="Heading2"/>
@@ -767,7 +577,7 @@
           <w:rFonts w:ascii="Times New Roman" w:hAnsi="Times New Roman"/>
           <w:sz w:val="24"/>
         </w:rPr>
-        <w:t xml:space="preserve">Edmond, C. (2024, December 13). Geopolitics and trade policy are becoming intertwined.</w:t>
+        <w:t xml:space="preserve">African Union. (2021).</w:t>
       </w:r>
       <w:r>
         <w:rPr>
@@ -783,14 +593,14 @@
           <w:iCs/>
           <w:sz w:val="24"/>
         </w:rPr>
-        <w:t xml:space="preserve">World Economic Forum</w:t>
-      </w:r>
-      <w:r>
-        <w:rPr>
-          <w:rFonts w:ascii="Times New Roman" w:hAnsi="Times New Roman"/>
-          <w:sz w:val="24"/>
-        </w:rPr>
-        <w:t xml:space="preserve">. https://www.weforum.org/stories/2024/12/global-trade-geopolitics-uncertainty-economic-policy/</w:t>
+        <w:t xml:space="preserve">Agreement establishing the African Continental Free Trade Area</w:t>
+      </w:r>
+      <w:r>
+        <w:rPr>
+          <w:rFonts w:ascii="Times New Roman" w:hAnsi="Times New Roman"/>
+          <w:sz w:val="24"/>
+        </w:rPr>
+        <w:t xml:space="preserve">. https://au.int/en/treaties/agreement-establishing-african-continental-free-trade-area</w:t>
       </w:r>
     </w:p>
     <w:p>
@@ -803,7 +613,7 @@
           <w:rFonts w:ascii="Times New Roman" w:hAnsi="Times New Roman"/>
           <w:sz w:val="24"/>
         </w:rPr>
-        <w:t xml:space="preserve">Greenlaw, S., Shapiro, D., &amp; MacDonald, D. (2022).</w:t>
+        <w:t xml:space="preserve">Edmond, C. (2024, December 13). Geopolitics and trade policy are becoming intertwined.</w:t>
       </w:r>
       <w:r>
         <w:rPr>
@@ -819,21 +629,14 @@
           <w:iCs/>
           <w:sz w:val="24"/>
         </w:rPr>
-        <w:t xml:space="preserve">Principles of economics</w:t>
-      </w:r>
-      <w:r>
-        <w:rPr>
-          <w:rFonts w:ascii="Times New Roman" w:hAnsi="Times New Roman"/>
-          <w:sz w:val="24"/>
-        </w:rPr>
-        <w:t xml:space="preserve"> </w:t>
-      </w:r>
-      <w:r>
-        <w:rPr>
-          <w:rFonts w:ascii="Times New Roman" w:hAnsi="Times New Roman"/>
-          <w:sz w:val="24"/>
-        </w:rPr>
-        <w:t xml:space="preserve">(3rd ed.). OpenStax. https://openstax.org/books/principles-economics-3e/pages/1-introduction</w:t>
+        <w:t xml:space="preserve">World Economic Forum</w:t>
+      </w:r>
+      <w:r>
+        <w:rPr>
+          <w:rFonts w:ascii="Times New Roman" w:hAnsi="Times New Roman"/>
+          <w:sz w:val="24"/>
+        </w:rPr>
+        <w:t xml:space="preserve">. https://www.weforum.org/stories/2024/12/global-trade-geopolitics-uncertainty-economic-policy/</w:t>
       </w:r>
     </w:p>
     <w:p>
@@ -846,7 +649,7 @@
           <w:rFonts w:ascii="Times New Roman" w:hAnsi="Times New Roman"/>
           <w:sz w:val="24"/>
         </w:rPr>
-        <w:t xml:space="preserve">World Bank Group. (2025).</w:t>
+        <w:t xml:space="preserve">Greenlaw, S., Shapiro, D., &amp; MacDonald, D. (2022).</w:t>
       </w:r>
       <w:r>
         <w:rPr>
@@ -862,6 +665,92 @@
           <w:iCs/>
           <w:sz w:val="24"/>
         </w:rPr>
+        <w:t xml:space="preserve">Principles of economics</w:t>
+      </w:r>
+      <w:r>
+        <w:rPr>
+          <w:rFonts w:ascii="Times New Roman" w:hAnsi="Times New Roman"/>
+          <w:sz w:val="24"/>
+        </w:rPr>
+        <w:t xml:space="preserve"> </w:t>
+      </w:r>
+      <w:r>
+        <w:rPr>
+          <w:rFonts w:ascii="Times New Roman" w:hAnsi="Times New Roman"/>
+          <w:sz w:val="24"/>
+        </w:rPr>
+        <w:t xml:space="preserve">(3rd ed.). OpenStax. https://openstax.org/books/principles-economics-3e/pages/1-introduction</w:t>
+      </w:r>
+    </w:p>
+    <w:p>
+      <w:pPr>
+        <w:pStyle w:val="BodyText"/>
+        <w:spacing w:line="480" w:lineRule="exact" w:after="0"/>
+      </w:pPr>
+      <w:r>
+        <w:rPr>
+          <w:rFonts w:ascii="Times New Roman" w:hAnsi="Times New Roman"/>
+          <w:sz w:val="24"/>
+        </w:rPr>
+        <w:t xml:space="preserve">Shapiro, D., MacDonald, D., Greenlaw, S. A., Dodge, E., Gamez, C., Jauregui, A., Keenan, D., Moledina, A., Richardson, C., &amp; Sonenshine, R. (2023).</w:t>
+      </w:r>
+      <w:r>
+        <w:rPr>
+          <w:rFonts w:ascii="Times New Roman" w:hAnsi="Times New Roman"/>
+          <w:sz w:val="24"/>
+        </w:rPr>
+        <w:t xml:space="preserve"> </w:t>
+      </w:r>
+      <w:r>
+        <w:rPr>
+          <w:rFonts w:ascii="Times New Roman" w:hAnsi="Times New Roman"/>
+          <w:i/>
+          <w:iCs/>
+          <w:sz w:val="24"/>
+        </w:rPr>
+        <w:t xml:space="preserve">Principles of macroeconomics</w:t>
+      </w:r>
+      <w:r>
+        <w:rPr>
+          <w:rFonts w:ascii="Times New Roman" w:hAnsi="Times New Roman"/>
+          <w:sz w:val="24"/>
+        </w:rPr>
+        <w:t xml:space="preserve"> </w:t>
+      </w:r>
+      <w:r>
+        <w:rPr>
+          <w:rFonts w:ascii="Times New Roman" w:hAnsi="Times New Roman"/>
+          <w:sz w:val="24"/>
+        </w:rPr>
+        <w:t xml:space="preserve">(3rd ed.). OpenStax. https://openstax.org/details/books/principles-macroeconomics-3e</w:t>
+      </w:r>
+    </w:p>
+    <w:p>
+      <w:pPr>
+        <w:pStyle w:val="BodyText"/>
+        <w:spacing w:line="480" w:lineRule="exact" w:after="0"/>
+      </w:pPr>
+      <w:r>
+        <w:rPr>
+          <w:rFonts w:ascii="Times New Roman" w:hAnsi="Times New Roman"/>
+          <w:sz w:val="24"/>
+        </w:rPr>
+        <w:t xml:space="preserve">World Bank Group. (2025).</w:t>
+      </w:r>
+      <w:r>
+        <w:rPr>
+          <w:rFonts w:ascii="Times New Roman" w:hAnsi="Times New Roman"/>
+          <w:sz w:val="24"/>
+        </w:rPr>
+        <w:t xml:space="preserve"> </w:t>
+      </w:r>
+      <w:r>
+        <w:rPr>
+          <w:rFonts w:ascii="Times New Roman" w:hAnsi="Times New Roman"/>
+          <w:i/>
+          <w:iCs/>
+          <w:sz w:val="24"/>
+        </w:rPr>
         <w:t xml:space="preserve">Global economic prospects: Chapter 1</w:t>
       </w:r>
       <w:r>
@@ -872,8 +761,8 @@
         <w:t xml:space="preserve">. World Bank Publications. https://doi.org/10.1596/978-1-4648-2147-9</w:t>
       </w:r>
     </w:p>
+    <w:bookmarkEnd w:id="14"/>
     <w:bookmarkEnd w:id="15"/>
-    <w:bookmarkEnd w:id="16"/>
     <w:sectPr>
       <w:footnotePr>
         <w:numRestart w:val="eachSect"/>
@@ -985,114 +874,8 @@
       </w:pPr>
     </w:lvl>
   </w:abstractNum>
-  <w:abstractNum w:abstractNumId="991">
-    <w:nsid w:val="0000A991"/>
-    <w:multiLevelType w:val="multilevel"/>
-    <w:lvl w:ilvl="0">
-      <w:numFmt w:val="bullet"/>
-      <w:lvlText w:val=""/>
-      <w:lvlJc w:val="left"/>
-      <w:pPr>
-        <w:ind w:left="720" w:hanging="360"/>
-      </w:pPr>
-      <w:rPr>
-        <w:rFonts w:ascii="Symbol" w:hAnsi="Symbol" w:cs="Symbol" w:hint="default"/>
-      </w:rPr>
-    </w:lvl>
-    <w:lvl w:ilvl="1">
-      <w:numFmt w:val="bullet"/>
-      <w:lvlText w:val="o"/>
-      <w:lvlJc w:val="left"/>
-      <w:pPr>
-        <w:ind w:left="1440" w:hanging="360"/>
-      </w:pPr>
-      <w:rPr>
-        <w:rFonts w:ascii="Courier New" w:hAnsi="Courier New" w:cs="Courier New" w:hint="default"/>
-      </w:rPr>
-    </w:lvl>
-    <w:lvl w:ilvl="2">
-      <w:numFmt w:val="bullet"/>
-      <w:lvlText w:val=""/>
-      <w:lvlJc w:val="left"/>
-      <w:pPr>
-        <w:ind w:left="2160" w:hanging="360"/>
-      </w:pPr>
-      <w:rPr>
-        <w:rFonts w:ascii="Wingdings" w:hAnsi="Wingdings" w:cs="Wingdings" w:hint="default"/>
-      </w:rPr>
-    </w:lvl>
-    <w:lvl w:ilvl="3">
-      <w:numFmt w:val="bullet"/>
-      <w:lvlText w:val=""/>
-      <w:lvlJc w:val="left"/>
-      <w:pPr>
-        <w:ind w:left="2880" w:hanging="360"/>
-      </w:pPr>
-      <w:rPr>
-        <w:rFonts w:ascii="Symbol" w:hAnsi="Symbol" w:cs="Symbol" w:hint="default"/>
-      </w:rPr>
-    </w:lvl>
-    <w:lvl w:ilvl="4">
-      <w:numFmt w:val="bullet"/>
-      <w:lvlText w:val="o"/>
-      <w:lvlJc w:val="left"/>
-      <w:pPr>
-        <w:ind w:left="3600" w:hanging="360"/>
-      </w:pPr>
-      <w:rPr>
-        <w:rFonts w:ascii="Courier New" w:hAnsi="Courier New" w:cs="Courier New" w:hint="default"/>
-      </w:rPr>
-    </w:lvl>
-    <w:lvl w:ilvl="5">
-      <w:numFmt w:val="bullet"/>
-      <w:lvlText w:val=""/>
-      <w:lvlJc w:val="left"/>
-      <w:pPr>
-        <w:ind w:left="4320" w:hanging="360"/>
-      </w:pPr>
-      <w:rPr>
-        <w:rFonts w:ascii="Wingdings" w:hAnsi="Wingdings" w:cs="Wingdings" w:hint="default"/>
-      </w:rPr>
-    </w:lvl>
-    <w:lvl w:ilvl="6">
-      <w:numFmt w:val="bullet"/>
-      <w:lvlText w:val=""/>
-      <w:lvlJc w:val="left"/>
-      <w:pPr>
-        <w:ind w:left="5040" w:hanging="360"/>
-      </w:pPr>
-      <w:rPr>
-        <w:rFonts w:ascii="Symbol" w:hAnsi="Symbol" w:cs="Symbol" w:hint="default"/>
-      </w:rPr>
-    </w:lvl>
-    <w:lvl w:ilvl="7">
-      <w:numFmt w:val="bullet"/>
-      <w:lvlText w:val="o"/>
-      <w:lvlJc w:val="left"/>
-      <w:pPr>
-        <w:ind w:left="5760" w:hanging="360"/>
-      </w:pPr>
-      <w:rPr>
-        <w:rFonts w:ascii="Courier New" w:hAnsi="Courier New" w:cs="Courier New" w:hint="default"/>
-      </w:rPr>
-    </w:lvl>
-    <w:lvl w:ilvl="8">
-      <w:numFmt w:val="bullet"/>
-      <w:lvlText w:val=""/>
-      <w:lvlJc w:val="left"/>
-      <w:pPr>
-        <w:ind w:left="6480" w:hanging="360"/>
-      </w:pPr>
-      <w:rPr>
-        <w:rFonts w:ascii="Wingdings" w:hAnsi="Wingdings" w:cs="Wingdings" w:hint="default"/>
-      </w:rPr>
-    </w:lvl>
-  </w:abstractNum>
   <w:num w:numId="1000">
     <w:abstractNumId w:val="990"/>
-  </w:num>
-  <w:num w:numId="1001">
-    <w:abstractNumId w:val="991"/>
   </w:num>
 </w:numbering>
 </file>

</xml_diff>